<commit_message>
sp4 part one done
</commit_message>
<xml_diff>
--- a/32SP Systemy projektuvannja/4/KNT-122_Onyshchenko_Variant-19_PR4.docx
+++ b/32SP Systemy projektuvannja/4/KNT-122_Onyshchenko_Variant-19_PR4.docx
@@ -814,9 +814,508 @@
         </w:rPr>
       </w:pPr>
       <w:r>
-        <w:rPr>
-          <w:lang w:val="uk-UA"/>
-        </w:rPr>
+        <w:drawing>
+          <wp:anchor behindDoc="0" distT="0" distB="0" distL="0" distR="0" simplePos="0" locked="0" layoutInCell="0" allowOverlap="1" relativeHeight="4">
+            <wp:simplePos x="0" y="0"/>
+            <wp:positionH relativeFrom="column">
+              <wp:align>center</wp:align>
+            </wp:positionH>
+            <wp:positionV relativeFrom="paragraph">
+              <wp:posOffset>635</wp:posOffset>
+            </wp:positionV>
+            <wp:extent cx="5731510" cy="5797550"/>
+            <wp:effectExtent l="0" t="0" r="0" b="0"/>
+            <wp:wrapSquare wrapText="largest"/>
+            <wp:docPr id="3" name="Зображення3" descr=""/>
+            <wp:cNvGraphicFramePr>
+              <a:graphicFrameLocks xmlns:a="http://schemas.openxmlformats.org/drawingml/2006/main" noChangeAspect="1"/>
+            </wp:cNvGraphicFramePr>
+            <a:graphic xmlns:a="http://schemas.openxmlformats.org/drawingml/2006/main">
+              <a:graphicData uri="http://schemas.openxmlformats.org/drawingml/2006/picture">
+                <pic:pic xmlns:pic="http://schemas.openxmlformats.org/drawingml/2006/picture">
+                  <pic:nvPicPr>
+                    <pic:cNvPr id="3" name="Зображення3" descr=""/>
+                    <pic:cNvPicPr>
+                      <a:picLocks noChangeAspect="1" noChangeArrowheads="1"/>
+                    </pic:cNvPicPr>
+                  </pic:nvPicPr>
+                  <pic:blipFill>
+                    <a:blip r:embed="rId4"/>
+                    <a:stretch>
+                      <a:fillRect/>
+                    </a:stretch>
+                  </pic:blipFill>
+                  <pic:spPr bwMode="auto">
+                    <a:xfrm>
+                      <a:off x="0" y="0"/>
+                      <a:ext cx="5731510" cy="5797550"/>
+                    </a:xfrm>
+                    <a:prstGeom prst="rect">
+                      <a:avLst/>
+                    </a:prstGeom>
+                    <a:noFill/>
+                  </pic:spPr>
+                </pic:pic>
+              </a:graphicData>
+            </a:graphic>
+          </wp:anchor>
+        </w:drawing>
+      </w:r>
+      <w:r>
+        <w:rPr>
+          <w:lang w:val="uk-UA"/>
+        </w:rPr>
+        <w:t>Рисунок 1.3 — Додані вікна виглядів</w:t>
+      </w:r>
+    </w:p>
+    <w:p>
+      <w:pPr>
+        <w:pStyle w:val="P1"/>
+        <w:rPr>
+          <w:lang w:val="uk-UA"/>
+        </w:rPr>
+      </w:pPr>
+      <w:r>
+        <w:rPr>
+          <w:lang w:val="uk-UA"/>
+        </w:rPr>
+      </w:r>
+    </w:p>
+    <w:p>
+      <w:pPr>
+        <w:pStyle w:val="P1"/>
+        <w:rPr>
+          <w:lang w:val="uk-UA"/>
+        </w:rPr>
+      </w:pPr>
+      <w:r>
+        <w:drawing>
+          <wp:anchor behindDoc="0" distT="0" distB="0" distL="0" distR="0" simplePos="0" locked="0" layoutInCell="0" allowOverlap="1" relativeHeight="5">
+            <wp:simplePos x="0" y="0"/>
+            <wp:positionH relativeFrom="column">
+              <wp:align>center</wp:align>
+            </wp:positionH>
+            <wp:positionV relativeFrom="paragraph">
+              <wp:posOffset>635</wp:posOffset>
+            </wp:positionV>
+            <wp:extent cx="5731510" cy="6240145"/>
+            <wp:effectExtent l="0" t="0" r="0" b="0"/>
+            <wp:wrapSquare wrapText="largest"/>
+            <wp:docPr id="4" name="Зображення4" descr=""/>
+            <wp:cNvGraphicFramePr>
+              <a:graphicFrameLocks xmlns:a="http://schemas.openxmlformats.org/drawingml/2006/main" noChangeAspect="1"/>
+            </wp:cNvGraphicFramePr>
+            <a:graphic xmlns:a="http://schemas.openxmlformats.org/drawingml/2006/main">
+              <a:graphicData uri="http://schemas.openxmlformats.org/drawingml/2006/picture">
+                <pic:pic xmlns:pic="http://schemas.openxmlformats.org/drawingml/2006/picture">
+                  <pic:nvPicPr>
+                    <pic:cNvPr id="4" name="Зображення4" descr=""/>
+                    <pic:cNvPicPr>
+                      <a:picLocks noChangeAspect="1" noChangeArrowheads="1"/>
+                    </pic:cNvPicPr>
+                  </pic:nvPicPr>
+                  <pic:blipFill>
+                    <a:blip r:embed="rId5"/>
+                    <a:stretch>
+                      <a:fillRect/>
+                    </a:stretch>
+                  </pic:blipFill>
+                  <pic:spPr bwMode="auto">
+                    <a:xfrm>
+                      <a:off x="0" y="0"/>
+                      <a:ext cx="5731510" cy="6240145"/>
+                    </a:xfrm>
+                    <a:prstGeom prst="rect">
+                      <a:avLst/>
+                    </a:prstGeom>
+                    <a:noFill/>
+                  </pic:spPr>
+                </pic:pic>
+              </a:graphicData>
+            </a:graphic>
+          </wp:anchor>
+        </w:drawing>
+      </w:r>
+      <w:r>
+        <w:rPr>
+          <w:lang w:val="uk-UA"/>
+        </w:rPr>
+        <w:t>Рисунок 1.4 — Видалення зображення вікна</w:t>
+      </w:r>
+    </w:p>
+    <w:p>
+      <w:pPr>
+        <w:pStyle w:val="P1"/>
+        <w:rPr>
+          <w:lang w:val="uk-UA"/>
+        </w:rPr>
+      </w:pPr>
+      <w:r>
+        <w:rPr>
+          <w:lang w:val="uk-UA"/>
+        </w:rPr>
+      </w:r>
+    </w:p>
+    <w:p>
+      <w:pPr>
+        <w:pStyle w:val="P1"/>
+        <w:rPr>
+          <w:lang w:val="uk-UA"/>
+        </w:rPr>
+      </w:pPr>
+      <w:r>
+        <w:drawing>
+          <wp:anchor behindDoc="0" distT="0" distB="0" distL="0" distR="0" simplePos="0" locked="0" layoutInCell="0" allowOverlap="1" relativeHeight="7">
+            <wp:simplePos x="0" y="0"/>
+            <wp:positionH relativeFrom="column">
+              <wp:align>center</wp:align>
+            </wp:positionH>
+            <wp:positionV relativeFrom="paragraph">
+              <wp:posOffset>635</wp:posOffset>
+            </wp:positionV>
+            <wp:extent cx="5731510" cy="4636770"/>
+            <wp:effectExtent l="0" t="0" r="0" b="0"/>
+            <wp:wrapSquare wrapText="largest"/>
+            <wp:docPr id="5" name="Зображення6" descr=""/>
+            <wp:cNvGraphicFramePr>
+              <a:graphicFrameLocks xmlns:a="http://schemas.openxmlformats.org/drawingml/2006/main" noChangeAspect="1"/>
+            </wp:cNvGraphicFramePr>
+            <a:graphic xmlns:a="http://schemas.openxmlformats.org/drawingml/2006/main">
+              <a:graphicData uri="http://schemas.openxmlformats.org/drawingml/2006/picture">
+                <pic:pic xmlns:pic="http://schemas.openxmlformats.org/drawingml/2006/picture">
+                  <pic:nvPicPr>
+                    <pic:cNvPr id="5" name="Зображення6" descr=""/>
+                    <pic:cNvPicPr>
+                      <a:picLocks noChangeAspect="1" noChangeArrowheads="1"/>
+                    </pic:cNvPicPr>
+                  </pic:nvPicPr>
+                  <pic:blipFill>
+                    <a:blip r:embed="rId6"/>
+                    <a:stretch>
+                      <a:fillRect/>
+                    </a:stretch>
+                  </pic:blipFill>
+                  <pic:spPr bwMode="auto">
+                    <a:xfrm>
+                      <a:off x="0" y="0"/>
+                      <a:ext cx="5731510" cy="4636770"/>
+                    </a:xfrm>
+                    <a:prstGeom prst="rect">
+                      <a:avLst/>
+                    </a:prstGeom>
+                    <a:noFill/>
+                  </pic:spPr>
+                </pic:pic>
+              </a:graphicData>
+            </a:graphic>
+          </wp:anchor>
+        </w:drawing>
+      </w:r>
+      <w:r>
+        <w:rPr>
+          <w:lang w:val="uk-UA"/>
+        </w:rPr>
+        <w:t>Рисунок 1.5 — Видавлена модель</w:t>
+      </w:r>
+    </w:p>
+    <w:p>
+      <w:pPr>
+        <w:pStyle w:val="P1"/>
+        <w:rPr>
+          <w:lang w:val="uk-UA"/>
+        </w:rPr>
+      </w:pPr>
+      <w:r>
+        <w:rPr>
+          <w:lang w:val="uk-UA"/>
+        </w:rPr>
+      </w:r>
+    </w:p>
+    <w:p>
+      <w:pPr>
+        <w:pStyle w:val="P1"/>
+        <w:rPr>
+          <w:lang w:val="uk-UA"/>
+        </w:rPr>
+      </w:pPr>
+      <w:r>
+        <w:drawing>
+          <wp:anchor behindDoc="0" distT="0" distB="0" distL="0" distR="0" simplePos="0" locked="0" layoutInCell="0" allowOverlap="1" relativeHeight="6">
+            <wp:simplePos x="0" y="0"/>
+            <wp:positionH relativeFrom="column">
+              <wp:align>center</wp:align>
+            </wp:positionH>
+            <wp:positionV relativeFrom="paragraph">
+              <wp:posOffset>635</wp:posOffset>
+            </wp:positionV>
+            <wp:extent cx="5731510" cy="4147820"/>
+            <wp:effectExtent l="0" t="0" r="0" b="0"/>
+            <wp:wrapSquare wrapText="largest"/>
+            <wp:docPr id="6" name="Зображення5" descr=""/>
+            <wp:cNvGraphicFramePr>
+              <a:graphicFrameLocks xmlns:a="http://schemas.openxmlformats.org/drawingml/2006/main" noChangeAspect="1"/>
+            </wp:cNvGraphicFramePr>
+            <a:graphic xmlns:a="http://schemas.openxmlformats.org/drawingml/2006/main">
+              <a:graphicData uri="http://schemas.openxmlformats.org/drawingml/2006/picture">
+                <pic:pic xmlns:pic="http://schemas.openxmlformats.org/drawingml/2006/picture">
+                  <pic:nvPicPr>
+                    <pic:cNvPr id="6" name="Зображення5" descr=""/>
+                    <pic:cNvPicPr>
+                      <a:picLocks noChangeAspect="1" noChangeArrowheads="1"/>
+                    </pic:cNvPicPr>
+                  </pic:nvPicPr>
+                  <pic:blipFill>
+                    <a:blip r:embed="rId7"/>
+                    <a:stretch>
+                      <a:fillRect/>
+                    </a:stretch>
+                  </pic:blipFill>
+                  <pic:spPr bwMode="auto">
+                    <a:xfrm>
+                      <a:off x="0" y="0"/>
+                      <a:ext cx="5731510" cy="4147820"/>
+                    </a:xfrm>
+                    <a:prstGeom prst="rect">
+                      <a:avLst/>
+                    </a:prstGeom>
+                    <a:noFill/>
+                  </pic:spPr>
+                </pic:pic>
+              </a:graphicData>
+            </a:graphic>
+          </wp:anchor>
+        </w:drawing>
+      </w:r>
+      <w:r>
+        <w:rPr>
+          <w:lang w:val="uk-UA"/>
+        </w:rPr>
+        <w:t>Рисунок 1.6 — Створене закруглення краю радіусу 3</w:t>
+      </w:r>
+    </w:p>
+    <w:p>
+      <w:pPr>
+        <w:pStyle w:val="P1"/>
+        <w:rPr>
+          <w:lang w:val="uk-UA"/>
+        </w:rPr>
+      </w:pPr>
+      <w:r>
+        <w:rPr>
+          <w:lang w:val="uk-UA"/>
+        </w:rPr>
+      </w:r>
+    </w:p>
+    <w:p>
+      <w:pPr>
+        <w:pStyle w:val="P1"/>
+        <w:rPr>
+          <w:lang w:val="uk-UA"/>
+        </w:rPr>
+      </w:pPr>
+      <w:r>
+        <w:drawing>
+          <wp:anchor behindDoc="0" distT="0" distB="0" distL="0" distR="0" simplePos="0" locked="0" layoutInCell="0" allowOverlap="1" relativeHeight="8">
+            <wp:simplePos x="0" y="0"/>
+            <wp:positionH relativeFrom="column">
+              <wp:align>center</wp:align>
+            </wp:positionH>
+            <wp:positionV relativeFrom="paragraph">
+              <wp:posOffset>635</wp:posOffset>
+            </wp:positionV>
+            <wp:extent cx="5731510" cy="4427220"/>
+            <wp:effectExtent l="0" t="0" r="0" b="0"/>
+            <wp:wrapSquare wrapText="largest"/>
+            <wp:docPr id="7" name="Зображення7" descr=""/>
+            <wp:cNvGraphicFramePr>
+              <a:graphicFrameLocks xmlns:a="http://schemas.openxmlformats.org/drawingml/2006/main" noChangeAspect="1"/>
+            </wp:cNvGraphicFramePr>
+            <a:graphic xmlns:a="http://schemas.openxmlformats.org/drawingml/2006/main">
+              <a:graphicData uri="http://schemas.openxmlformats.org/drawingml/2006/picture">
+                <pic:pic xmlns:pic="http://schemas.openxmlformats.org/drawingml/2006/picture">
+                  <pic:nvPicPr>
+                    <pic:cNvPr id="7" name="Зображення7" descr=""/>
+                    <pic:cNvPicPr>
+                      <a:picLocks noChangeAspect="1" noChangeArrowheads="1"/>
+                    </pic:cNvPicPr>
+                  </pic:nvPicPr>
+                  <pic:blipFill>
+                    <a:blip r:embed="rId8"/>
+                    <a:stretch>
+                      <a:fillRect/>
+                    </a:stretch>
+                  </pic:blipFill>
+                  <pic:spPr bwMode="auto">
+                    <a:xfrm>
+                      <a:off x="0" y="0"/>
+                      <a:ext cx="5731510" cy="4427220"/>
+                    </a:xfrm>
+                    <a:prstGeom prst="rect">
+                      <a:avLst/>
+                    </a:prstGeom>
+                    <a:noFill/>
+                  </pic:spPr>
+                </pic:pic>
+              </a:graphicData>
+            </a:graphic>
+          </wp:anchor>
+        </w:drawing>
+      </w:r>
+      <w:r>
+        <w:rPr>
+          <w:lang w:val="uk-UA"/>
+        </w:rPr>
+        <w:t>Рисунок 1.7 — Додане коло для віднімання</w:t>
+      </w:r>
+    </w:p>
+    <w:p>
+      <w:pPr>
+        <w:pStyle w:val="P1"/>
+        <w:rPr>
+          <w:lang w:val="uk-UA"/>
+        </w:rPr>
+      </w:pPr>
+      <w:r>
+        <w:rPr>
+          <w:lang w:val="uk-UA"/>
+        </w:rPr>
+      </w:r>
+    </w:p>
+    <w:p>
+      <w:pPr>
+        <w:pStyle w:val="P1"/>
+        <w:rPr>
+          <w:lang w:val="uk-UA"/>
+        </w:rPr>
+      </w:pPr>
+      <w:r>
+        <w:drawing>
+          <wp:anchor behindDoc="0" distT="0" distB="0" distL="0" distR="0" simplePos="0" locked="0" layoutInCell="0" allowOverlap="1" relativeHeight="9">
+            <wp:simplePos x="0" y="0"/>
+            <wp:positionH relativeFrom="column">
+              <wp:align>center</wp:align>
+            </wp:positionH>
+            <wp:positionV relativeFrom="paragraph">
+              <wp:posOffset>635</wp:posOffset>
+            </wp:positionV>
+            <wp:extent cx="5731510" cy="3223260"/>
+            <wp:effectExtent l="0" t="0" r="0" b="0"/>
+            <wp:wrapSquare wrapText="largest"/>
+            <wp:docPr id="8" name="Зображення8" descr=""/>
+            <wp:cNvGraphicFramePr>
+              <a:graphicFrameLocks xmlns:a="http://schemas.openxmlformats.org/drawingml/2006/main" noChangeAspect="1"/>
+            </wp:cNvGraphicFramePr>
+            <a:graphic xmlns:a="http://schemas.openxmlformats.org/drawingml/2006/main">
+              <a:graphicData uri="http://schemas.openxmlformats.org/drawingml/2006/picture">
+                <pic:pic xmlns:pic="http://schemas.openxmlformats.org/drawingml/2006/picture">
+                  <pic:nvPicPr>
+                    <pic:cNvPr id="8" name="Зображення8" descr=""/>
+                    <pic:cNvPicPr>
+                      <a:picLocks noChangeAspect="1" noChangeArrowheads="1"/>
+                    </pic:cNvPicPr>
+                  </pic:nvPicPr>
+                  <pic:blipFill>
+                    <a:blip r:embed="rId9"/>
+                    <a:stretch>
+                      <a:fillRect/>
+                    </a:stretch>
+                  </pic:blipFill>
+                  <pic:spPr bwMode="auto">
+                    <a:xfrm>
+                      <a:off x="0" y="0"/>
+                      <a:ext cx="5731510" cy="3223260"/>
+                    </a:xfrm>
+                    <a:prstGeom prst="rect">
+                      <a:avLst/>
+                    </a:prstGeom>
+                    <a:noFill/>
+                  </pic:spPr>
+                </pic:pic>
+              </a:graphicData>
+            </a:graphic>
+          </wp:anchor>
+        </w:drawing>
+      </w:r>
+      <w:r>
+        <w:rPr>
+          <w:lang w:val="uk-UA"/>
+        </w:rPr>
+        <w:t>Рисунок 1.8 — Видавлене велике коло</w:t>
+      </w:r>
+    </w:p>
+    <w:p>
+      <w:pPr>
+        <w:pStyle w:val="P1"/>
+        <w:rPr>
+          <w:lang w:val="uk-UA"/>
+        </w:rPr>
+      </w:pPr>
+      <w:r>
+        <w:rPr>
+          <w:lang w:val="uk-UA"/>
+        </w:rPr>
+      </w:r>
+    </w:p>
+    <w:p>
+      <w:pPr>
+        <w:pStyle w:val="P1"/>
+        <w:rPr>
+          <w:lang w:val="uk-UA"/>
+        </w:rPr>
+      </w:pPr>
+      <w:r>
+        <w:drawing>
+          <wp:anchor behindDoc="0" distT="0" distB="0" distL="0" distR="0" simplePos="0" locked="0" layoutInCell="0" allowOverlap="1" relativeHeight="10">
+            <wp:simplePos x="0" y="0"/>
+            <wp:positionH relativeFrom="column">
+              <wp:align>center</wp:align>
+            </wp:positionH>
+            <wp:positionV relativeFrom="paragraph">
+              <wp:posOffset>635</wp:posOffset>
+            </wp:positionV>
+            <wp:extent cx="5731510" cy="2854960"/>
+            <wp:effectExtent l="0" t="0" r="0" b="0"/>
+            <wp:wrapSquare wrapText="largest"/>
+            <wp:docPr id="9" name="Зображення9" descr=""/>
+            <wp:cNvGraphicFramePr>
+              <a:graphicFrameLocks xmlns:a="http://schemas.openxmlformats.org/drawingml/2006/main" noChangeAspect="1"/>
+            </wp:cNvGraphicFramePr>
+            <a:graphic xmlns:a="http://schemas.openxmlformats.org/drawingml/2006/main">
+              <a:graphicData uri="http://schemas.openxmlformats.org/drawingml/2006/picture">
+                <pic:pic xmlns:pic="http://schemas.openxmlformats.org/drawingml/2006/picture">
+                  <pic:nvPicPr>
+                    <pic:cNvPr id="9" name="Зображення9" descr=""/>
+                    <pic:cNvPicPr>
+                      <a:picLocks noChangeAspect="1" noChangeArrowheads="1"/>
+                    </pic:cNvPicPr>
+                  </pic:nvPicPr>
+                  <pic:blipFill>
+                    <a:blip r:embed="rId10"/>
+                    <a:stretch>
+                      <a:fillRect/>
+                    </a:stretch>
+                  </pic:blipFill>
+                  <pic:spPr bwMode="auto">
+                    <a:xfrm>
+                      <a:off x="0" y="0"/>
+                      <a:ext cx="5731510" cy="2854960"/>
+                    </a:xfrm>
+                    <a:prstGeom prst="rect">
+                      <a:avLst/>
+                    </a:prstGeom>
+                    <a:noFill/>
+                  </pic:spPr>
+                </pic:pic>
+              </a:graphicData>
+            </a:graphic>
+          </wp:anchor>
+        </w:drawing>
+      </w:r>
+      <w:r>
+        <w:rPr>
+          <w:lang w:val="uk-UA"/>
+        </w:rPr>
+        <w:t>Рисунок 1.9 — Відняте коло з великого</w:t>
       </w:r>
     </w:p>
     <w:sectPr>
@@ -855,7 +1354,9 @@
     <w:pPr>
       <w:widowControl/>
       <w:suppressAutoHyphens w:val="true"/>
+      <w:kinsoku w:val="true"/>
       <w:overflowPunct w:val="true"/>
+      <w:autoSpaceDE w:val="true"/>
       <w:bidi w:val="0"/>
       <w:spacing w:lineRule="auto" w:line="360" w:before="0" w:after="0"/>
       <w:ind w:firstLine="851"/>
@@ -879,6 +1380,10 @@
     <w:pPr>
       <w:keepNext w:val="true"/>
       <w:keepLines/>
+      <w:numPr>
+        <w:ilvl w:val="0"/>
+        <w:numId w:val="0"/>
+      </w:numPr>
       <w:ind w:firstLine="851"/>
       <w:outlineLvl w:val="0"/>
     </w:pPr>
@@ -898,6 +1403,10 @@
     <w:pPr>
       <w:keepNext w:val="true"/>
       <w:keepLines/>
+      <w:numPr>
+        <w:ilvl w:val="0"/>
+        <w:numId w:val="0"/>
+      </w:numPr>
       <w:spacing w:before="40" w:after="0"/>
       <w:ind w:firstLine="851"/>
       <w:outlineLvl w:val="1"/>
@@ -918,6 +1427,10 @@
     <w:pPr>
       <w:keepNext w:val="true"/>
       <w:keepLines/>
+      <w:numPr>
+        <w:ilvl w:val="0"/>
+        <w:numId w:val="0"/>
+      </w:numPr>
       <w:spacing w:before="40" w:after="0"/>
       <w:ind w:firstLine="851"/>
       <w:outlineLvl w:val="2"/>
@@ -1426,6 +1939,10 @@
     <w:link w:val="H4"/>
     <w:qFormat/>
     <w:pPr>
+      <w:numPr>
+        <w:ilvl w:val="0"/>
+        <w:numId w:val="0"/>
+      </w:numPr>
       <w:ind w:firstLine="851"/>
       <w:outlineLvl w:val="3"/>
     </w:pPr>
@@ -1483,6 +2000,10 @@
     <w:link w:val="H5"/>
     <w:qFormat/>
     <w:pPr>
+      <w:numPr>
+        <w:ilvl w:val="0"/>
+        <w:numId w:val="0"/>
+      </w:numPr>
       <w:ind w:firstLine="851"/>
       <w:outlineLvl w:val="4"/>
     </w:pPr>
@@ -1497,6 +2018,10 @@
     <w:link w:val="H6"/>
     <w:qFormat/>
     <w:pPr>
+      <w:numPr>
+        <w:ilvl w:val="0"/>
+        <w:numId w:val="0"/>
+      </w:numPr>
       <w:ind w:firstLine="851"/>
       <w:outlineLvl w:val="5"/>
     </w:pPr>

</xml_diff>

<commit_message>
sp4 dimensions for one, bottom view
</commit_message>
<xml_diff>
--- a/32SP Systemy projektuvannja/4/KNT-122_Onyshchenko_Variant-19_PR4.docx
+++ b/32SP Systemy projektuvannja/4/KNT-122_Onyshchenko_Variant-19_PR4.docx
@@ -560,6 +560,16 @@
       <w:r>
         <w:rPr/>
         <w:t>Виконання</w:t>
+      </w:r>
+    </w:p>
+    <w:p>
+      <w:pPr>
+        <w:pStyle w:val="H2"/>
+        <w:rPr/>
+      </w:pPr>
+      <w:r>
+        <w:rPr/>
+        <w:t>Створення шаблону</w:t>
       </w:r>
     </w:p>
     <w:p>
@@ -958,6 +968,29 @@
     </w:p>
     <w:p>
       <w:pPr>
+        <w:pStyle w:val="H2"/>
+        <w:rPr/>
+      </w:pPr>
+      <w:r>
+        <w:rPr/>
+        <w:t xml:space="preserve">Створення моделі </w:t>
+      </w:r>
+    </w:p>
+    <w:p>
+      <w:pPr>
+        <w:pStyle w:val="P1"/>
+        <w:rPr>
+          <w:lang w:val="uk-UA"/>
+        </w:rPr>
+      </w:pPr>
+      <w:r>
+        <w:rPr>
+          <w:lang w:val="uk-UA"/>
+        </w:rPr>
+      </w:r>
+    </w:p>
+    <w:p>
+      <w:pPr>
         <w:pStyle w:val="P1"/>
         <w:rPr>
           <w:lang w:val="uk-UA"/>
@@ -1316,6 +1349,100 @@
           <w:lang w:val="uk-UA"/>
         </w:rPr>
         <w:t>Рисунок 1.9 — Відняте коло з великого</w:t>
+      </w:r>
+    </w:p>
+    <w:p>
+      <w:pPr>
+        <w:pStyle w:val="P1"/>
+        <w:rPr>
+          <w:lang w:val="uk-UA"/>
+        </w:rPr>
+      </w:pPr>
+      <w:r>
+        <w:rPr>
+          <w:lang w:val="uk-UA"/>
+        </w:rPr>
+      </w:r>
+    </w:p>
+    <w:p>
+      <w:pPr>
+        <w:pStyle w:val="H2"/>
+        <w:rPr/>
+      </w:pPr>
+      <w:r>
+        <w:rPr/>
+        <w:t>Візуалізація моделі</w:t>
+      </w:r>
+    </w:p>
+    <w:p>
+      <w:pPr>
+        <w:pStyle w:val="P1"/>
+        <w:rPr/>
+      </w:pPr>
+      <w:r>
+        <w:rPr/>
+      </w:r>
+    </w:p>
+    <w:p>
+      <w:pPr>
+        <w:pStyle w:val="P1"/>
+        <w:rPr>
+          <w:lang w:val="uk-UA"/>
+        </w:rPr>
+      </w:pPr>
+      <w:r>
+        <w:drawing>
+          <wp:anchor behindDoc="0" distT="0" distB="0" distL="0" distR="0" simplePos="0" locked="0" layoutInCell="0" allowOverlap="1" relativeHeight="11">
+            <wp:simplePos x="0" y="0"/>
+            <wp:positionH relativeFrom="column">
+              <wp:align>center</wp:align>
+            </wp:positionH>
+            <wp:positionV relativeFrom="paragraph">
+              <wp:posOffset>635</wp:posOffset>
+            </wp:positionV>
+            <wp:extent cx="5731510" cy="3193415"/>
+            <wp:effectExtent l="0" t="0" r="0" b="0"/>
+            <wp:wrapSquare wrapText="largest"/>
+            <wp:docPr id="10" name="Зображення10" descr=""/>
+            <wp:cNvGraphicFramePr>
+              <a:graphicFrameLocks xmlns:a="http://schemas.openxmlformats.org/drawingml/2006/main" noChangeAspect="1"/>
+            </wp:cNvGraphicFramePr>
+            <a:graphic xmlns:a="http://schemas.openxmlformats.org/drawingml/2006/main">
+              <a:graphicData uri="http://schemas.openxmlformats.org/drawingml/2006/picture">
+                <pic:pic xmlns:pic="http://schemas.openxmlformats.org/drawingml/2006/picture">
+                  <pic:nvPicPr>
+                    <pic:cNvPr id="10" name="Зображення10" descr=""/>
+                    <pic:cNvPicPr>
+                      <a:picLocks noChangeAspect="1" noChangeArrowheads="1"/>
+                    </pic:cNvPicPr>
+                  </pic:nvPicPr>
+                  <pic:blipFill>
+                    <a:blip r:embed="rId11"/>
+                    <a:stretch>
+                      <a:fillRect/>
+                    </a:stretch>
+                  </pic:blipFill>
+                  <pic:spPr bwMode="auto">
+                    <a:xfrm>
+                      <a:off x="0" y="0"/>
+                      <a:ext cx="5731510" cy="3193415"/>
+                    </a:xfrm>
+                    <a:prstGeom prst="rect">
+                      <a:avLst/>
+                    </a:prstGeom>
+                    <a:noFill/>
+                  </pic:spPr>
+                </pic:pic>
+              </a:graphicData>
+            </a:graphic>
+          </wp:anchor>
+        </w:drawing>
+      </w:r>
+      <w:r>
+        <w:rPr>
+          <w:lang w:val="uk-UA"/>
+        </w:rPr>
+        <w:t>Рисунок 1.10 — Додані види та вимкнені невидимі лінії</w:t>
       </w:r>
     </w:p>
     <w:sectPr>

</xml_diff>